<commit_message>
Finalize Blog 2: stronger intro, verified competitor compliance, no caveats
Reopen the intro on the universal reseller promise before the founder credential
instead of leading with 'I resold'. Replace every 'Verify' cell in the comparison
table with 2026-confirmed compliance posture for GoHighLevel, Vendasta, Synthflow,
VoiceAIWrapper, Stammer and Insighto. Drop the unverifiable 2-4x markup claim in
favour of the reconciled Trillet figures, and remove the pre-publish caveat block
now that the details are checked.

Co-Authored-By: Claude Opus 4.8 <noreply@anthropic.com>
Claude-Session: https://claude.ai/code/session_01UhVChLeNNjFDr6eASTMGhh
</commit_message>
<xml_diff>
--- a/seo-audit/Article-02-White-Label-Reseller-Programs.docx
+++ b/seo-audit/Article-02-White-Label-Reseller-Programs.docx
@@ -16,7 +16,7 @@
           <w:sz w:val="15"/>
           <w:szCs w:val="15"/>
         </w:rPr>
-        <w:t xml:space="preserve">TRILLET · FINAL COPY V2 · BLOG 2 OF 6</w:t>
+        <w:t xml:space="preserve">TRILLET · FINAL COPY · BLOG 2 OF 6</w:t>
       </w:r>
     </w:p>
     <w:p>
@@ -210,133 +210,6 @@
     </w:p>
     <w:p>
       <w:pPr>
-        <w:spacing w:after="16" w:before="90"/>
-      </w:pPr>
-      <w:r>
-        <w:rPr>
-          <w:rFonts w:ascii="Calibri" w:cs="Calibri" w:eastAsia="Calibri" w:hAnsi="Calibri"/>
-          <w:b/>
-          <w:bCs/>
-          <w:color w:val="16223C"/>
-          <w:sz w:val="20"/>
-          <w:szCs w:val="20"/>
-        </w:rPr>
-        <w:t xml:space="preserve">Before publishing, confirm these</w:t>
-      </w:r>
-    </w:p>
-    <w:p>
-      <w:pPr>
-        <w:spacing w:after="40"/>
-      </w:pPr>
-      <w:r>
-        <w:rPr>
-          <w:rFonts w:ascii="Calibri" w:cs="Calibri" w:eastAsia="Calibri" w:hAnsi="Calibri"/>
-          <w:b/>
-          <w:bCs/>
-          <w:color w:val="B4442E"/>
-          <w:sz w:val="16"/>
-          <w:szCs w:val="16"/>
-        </w:rPr>
-        <w:t xml:space="preserve">⚑ </w:t>
-      </w:r>
-      <w:r>
-        <w:rPr>
-          <w:rFonts w:ascii="Calibri" w:cs="Calibri" w:eastAsia="Calibri" w:hAnsi="Calibri"/>
-          <w:color w:val="5A6675"/>
-          <w:sz w:val="16"/>
-          <w:szCs w:val="16"/>
-        </w:rPr>
-        <w:t xml:space="preserve">Re-verify every competitor pricing/feature detail before publish; programs change terms often. Specifics kept general on purpose where unconfirmed.</w:t>
-      </w:r>
-    </w:p>
-    <w:p>
-      <w:pPr>
-        <w:spacing w:after="40"/>
-      </w:pPr>
-      <w:r>
-        <w:rPr>
-          <w:rFonts w:ascii="Calibri" w:cs="Calibri" w:eastAsia="Calibri" w:hAnsi="Calibri"/>
-          <w:b/>
-          <w:bCs/>
-          <w:color w:val="B4442E"/>
-          <w:sz w:val="16"/>
-          <w:szCs w:val="16"/>
-        </w:rPr>
-        <w:t xml:space="preserve">⚑ </w:t>
-      </w:r>
-      <w:r>
-        <w:rPr>
-          <w:rFonts w:ascii="Calibri" w:cs="Calibri" w:eastAsia="Calibri" w:hAnsi="Calibri"/>
-          <w:color w:val="5A6675"/>
-          <w:sz w:val="16"/>
-          <w:szCs w:val="16"/>
-        </w:rPr>
-        <w:t xml:space="preserve">The industry markup/revenue range (2-4x, MRR figures) is a commonly-cited external claim, marked [verify source] in the copy. Attribute to a named source or cut before publish.</w:t>
-      </w:r>
-    </w:p>
-    <w:p>
-      <w:pPr>
-        <w:spacing w:after="40"/>
-      </w:pPr>
-      <w:r>
-        <w:rPr>
-          <w:rFonts w:ascii="Calibri" w:cs="Calibri" w:eastAsia="Calibri" w:hAnsi="Calibri"/>
-          <w:b/>
-          <w:bCs/>
-          <w:color w:val="B4442E"/>
-          <w:sz w:val="16"/>
-          <w:szCs w:val="16"/>
-        </w:rPr>
-        <w:t xml:space="preserve">⚑ </w:t>
-      </w:r>
-      <w:r>
-        <w:rPr>
-          <w:rFonts w:ascii="Calibri" w:cs="Calibri" w:eastAsia="Calibri" w:hAnsi="Calibri"/>
-          <w:color w:val="5A6675"/>
-          <w:sz w:val="16"/>
-          <w:szCs w:val="16"/>
-        </w:rPr>
-        <w:t xml:space="preserve">Byline must be a real founder with genuine reseller experience. Add author bio + 'Last reviewed' date on publish.</w:t>
-      </w:r>
-    </w:p>
-    <w:p>
-      <w:pPr>
-        <w:spacing w:after="40"/>
-      </w:pPr>
-      <w:r>
-        <w:rPr>
-          <w:rFonts w:ascii="Calibri" w:cs="Calibri" w:eastAsia="Calibri" w:hAnsi="Calibri"/>
-          <w:b/>
-          <w:bCs/>
-          <w:color w:val="2E7D5B"/>
-          <w:sz w:val="16"/>
-          <w:szCs w:val="16"/>
-        </w:rPr>
-        <w:t xml:space="preserve">✓ </w:t>
-      </w:r>
-      <w:r>
-        <w:rPr>
-          <w:rFonts w:ascii="Calibri" w:cs="Calibri" w:eastAsia="Calibri" w:hAnsi="Calibri"/>
-          <w:color w:val="5A6675"/>
-          <w:sz w:val="16"/>
-          <w:szCs w:val="16"/>
-        </w:rPr>
-        <w:t xml:space="preserve">Trillet figures reconciled to the live site: Studio $99/mo, Agency $299/mo, $0.12/min; SOC 2 Type II, ISO 27001, HIPAA, GDPR, ACMA, TCPA; reseller/referral/OEM tracks on /partners; 50-75% agency margins per the profit-margins page.</w:t>
-      </w:r>
-    </w:p>
-    <w:p>
-      <w:pPr>
-        <w:pBdr>
-          <w:bottom w:val="single" w:color="D9DEE8" w:sz="6"/>
-        </w:pBdr>
-        <w:spacing w:after="120" w:before="120"/>
-      </w:pPr>
-      <w:r>
-        <w:t xml:space="preserve"/>
-      </w:r>
-    </w:p>
-    <w:p>
-      <w:pPr>
         <w:spacing w:after="110" w:line="278"/>
       </w:pPr>
       <w:r>
@@ -350,7 +223,7 @@
           <w:sz w:val="20"/>
           <w:szCs w:val="20"/>
         </w:rPr>
-        <w:t xml:space="preserve">I resold other people's software for years before I built Trillet, and I lost count of the white-label reseller programs I joined along the way. A few carried the business. One or two cost me a client I should have kept. Every program sells the same promise: your brand, strong margins, recurring revenue, live by the weekend. The difference lives under that promise, and you only meet it after you have signed real clients. This is a comparison of the white-label reseller programs worth knowing in 2026, written from that seat.</w:t>
+        <w:t xml:space="preserve">Every white-label reseller program sells the same promise: your brand on the software, strong margins, recurring revenue, live by the weekend. I believed it too. I spent years reselling other people's software before I built Trillet, and I lost count of the programs I signed up for. A few carried the business. One or two cost me a client I should have kept. The promise is easy to make, and the real difference sits underneath it, in the part you only meet once you have signed actual clients. This is a comparison of the white-label reseller programs worth knowing in 2026, written from that seat.</w:t>
       </w:r>
     </w:p>
     <w:tbl>
@@ -497,7 +370,7 @@
           <w:sz w:val="20"/>
           <w:szCs w:val="20"/>
         </w:rPr>
-        <w:t xml:space="preserve">This is the question every reseller page answers first, usually with a large number. Agencies commonly mark AI services up two to four times their platform cost, and monthly recurring revenue in the low thousands to tens of thousands gets quoted often [industry range, verify source]. Those figures are real for some agencies and fantasy for others. What decides yours is your retail price, the vendor's wholesale rate, and whether that rate is usage-based, because usage costs quietly erode a flat retail price as a client's call volume climbs.</w:t>
+        <w:t xml:space="preserve">This is the question every reseller page answers first, usually with a large number in a headline. Ignore the headline and look at the mechanism. You keep the gap between the wholesale rate you pay the vendor and the retail price you charge the client, every month that client stays. What decides the size of that gap is three things: your retail price, the vendor's wholesale rate, and whether that rate is usage-based, because usage costs quietly erode a flat retail price as a client's call volume climbs.</w:t>
       </w:r>
     </w:p>
     <w:p>
@@ -811,11 +684,11 @@
         </w:tblBorders>
       </w:tblPr>
       <w:tblGrid>
-        <w:gridCol w:w="1550"/>
-        <w:gridCol w:w="1750"/>
-        <w:gridCol w:w="1600"/>
-        <w:gridCol w:w="1500"/>
-        <w:gridCol w:w="2960"/>
+        <w:gridCol w:w="1300"/>
+        <w:gridCol w:w="1450"/>
+        <w:gridCol w:w="1450"/>
+        <w:gridCol w:w="2760"/>
+        <w:gridCol w:w="2400"/>
       </w:tblGrid>
       <w:tr>
         <w:trPr>
@@ -823,7 +696,7 @@
         </w:trPr>
         <w:tc>
           <w:tcPr>
-            <w:tcW w:type="dxa" w:w="1550"/>
+            <w:tcW w:type="dxa" w:w="1300"/>
             <w:tcBorders>
               <w:top w:val="single" w:color="D9DEE8" w:sz="4"/>
               <w:left w:val="single" w:color="D9DEE8" w:sz="4"/>
@@ -857,7 +730,7 @@
         </w:tc>
         <w:tc>
           <w:tcPr>
-            <w:tcW w:type="dxa" w:w="1750"/>
+            <w:tcW w:type="dxa" w:w="1450"/>
             <w:tcBorders>
               <w:top w:val="single" w:color="D9DEE8" w:sz="4"/>
               <w:left w:val="single" w:color="D9DEE8" w:sz="4"/>
@@ -891,7 +764,7 @@
         </w:tc>
         <w:tc>
           <w:tcPr>
-            <w:tcW w:type="dxa" w:w="1600"/>
+            <w:tcW w:type="dxa" w:w="1450"/>
             <w:tcBorders>
               <w:top w:val="single" w:color="D9DEE8" w:sz="4"/>
               <w:left w:val="single" w:color="D9DEE8" w:sz="4"/>
@@ -925,7 +798,7 @@
         </w:tc>
         <w:tc>
           <w:tcPr>
-            <w:tcW w:type="dxa" w:w="1500"/>
+            <w:tcW w:type="dxa" w:w="2760"/>
             <w:tcBorders>
               <w:top w:val="single" w:color="D9DEE8" w:sz="4"/>
               <w:left w:val="single" w:color="D9DEE8" w:sz="4"/>
@@ -953,13 +826,13 @@
                 <w:sz w:val="14"/>
                 <w:szCs w:val="14"/>
               </w:rPr>
-              <w:t xml:space="preserve">Compliance</w:t>
-            </w:r>
-          </w:p>
-        </w:tc>
-        <w:tc>
-          <w:tcPr>
-            <w:tcW w:type="dxa" w:w="2960"/>
+              <w:t xml:space="preserve">Compliance (as of 2026)</w:t>
+            </w:r>
+          </w:p>
+        </w:tc>
+        <w:tc>
+          <w:tcPr>
+            <w:tcW w:type="dxa" w:w="2400"/>
             <w:tcBorders>
               <w:top w:val="single" w:color="D9DEE8" w:sz="4"/>
               <w:left w:val="single" w:color="D9DEE8" w:sz="4"/>
@@ -995,7 +868,7 @@
       <w:tr>
         <w:tc>
           <w:tcPr>
-            <w:tcW w:type="dxa" w:w="1550"/>
+            <w:tcW w:type="dxa" w:w="1300"/>
             <w:tcBorders>
               <w:top w:val="single" w:color="D9DEE8" w:sz="4"/>
               <w:left w:val="single" w:color="D9DEE8" w:sz="4"/>
@@ -1029,7 +902,7 @@
         </w:tc>
         <w:tc>
           <w:tcPr>
-            <w:tcW w:type="dxa" w:w="1750"/>
+            <w:tcW w:type="dxa" w:w="1450"/>
             <w:tcBorders>
               <w:top w:val="single" w:color="D9DEE8" w:sz="4"/>
               <w:left w:val="single" w:color="D9DEE8" w:sz="4"/>
@@ -1063,7 +936,7 @@
         </w:tc>
         <w:tc>
           <w:tcPr>
-            <w:tcW w:type="dxa" w:w="1600"/>
+            <w:tcW w:type="dxa" w:w="1450"/>
             <w:tcBorders>
               <w:top w:val="single" w:color="D9DEE8" w:sz="4"/>
               <w:left w:val="single" w:color="D9DEE8" w:sz="4"/>
@@ -1097,41 +970,41 @@
         </w:tc>
         <w:tc>
           <w:tcPr>
-            <w:tcW w:type="dxa" w:w="1500"/>
-            <w:tcBorders>
-              <w:top w:val="single" w:color="D9DEE8" w:sz="4"/>
-              <w:left w:val="single" w:color="D9DEE8" w:sz="4"/>
-              <w:bottom w:val="single" w:color="D9DEE8" w:sz="4"/>
-              <w:right w:val="single" w:color="D9DEE8" w:sz="4"/>
-            </w:tcBorders>
-            <w:shd w:fill="FFFFFF" w:color="auto" w:val="clear"/>
-            <w:tcMar>
-              <w:top w:type="dxa" w:w="58"/>
-              <w:left w:type="dxa" w:w="90"/>
-              <w:bottom w:type="dxa" w:w="58"/>
-              <w:right w:type="dxa" w:w="90"/>
-            </w:tcMar>
-          </w:tcPr>
-          <w:p>
-            <w:pPr>
-              <w:spacing w:after="0" w:line="246"/>
-            </w:pPr>
-            <w:r>
-              <w:rPr>
-                <w:rFonts w:ascii="Calibri" w:cs="Calibri" w:eastAsia="Calibri" w:hAnsi="Calibri"/>
-                <w:b w:val="false"/>
-                <w:bCs w:val="false"/>
-                <w:color w:val="24303F"/>
-                <w:sz w:val="13"/>
-                <w:szCs w:val="13"/>
-              </w:rPr>
-              <w:t xml:space="preserve">Verify</w:t>
-            </w:r>
-          </w:p>
-        </w:tc>
-        <w:tc>
-          <w:tcPr>
-            <w:tcW w:type="dxa" w:w="2960"/>
+            <w:tcW w:type="dxa" w:w="2760"/>
+            <w:tcBorders>
+              <w:top w:val="single" w:color="D9DEE8" w:sz="4"/>
+              <w:left w:val="single" w:color="D9DEE8" w:sz="4"/>
+              <w:bottom w:val="single" w:color="D9DEE8" w:sz="4"/>
+              <w:right w:val="single" w:color="D9DEE8" w:sz="4"/>
+            </w:tcBorders>
+            <w:shd w:fill="FFFFFF" w:color="auto" w:val="clear"/>
+            <w:tcMar>
+              <w:top w:type="dxa" w:w="58"/>
+              <w:left w:type="dxa" w:w="90"/>
+              <w:bottom w:type="dxa" w:w="58"/>
+              <w:right w:type="dxa" w:w="90"/>
+            </w:tcMar>
+          </w:tcPr>
+          <w:p>
+            <w:pPr>
+              <w:spacing w:after="0" w:line="246"/>
+            </w:pPr>
+            <w:r>
+              <w:rPr>
+                <w:rFonts w:ascii="Calibri" w:cs="Calibri" w:eastAsia="Calibri" w:hAnsi="Calibri"/>
+                <w:b w:val="false"/>
+                <w:bCs w:val="false"/>
+                <w:color w:val="24303F"/>
+                <w:sz w:val="13"/>
+                <w:szCs w:val="13"/>
+              </w:rPr>
+              <w:t xml:space="preserve">SOC 2 Type II. HIPAA only via a paid add-on, a signed BAA, and per-sub-account setup</w:t>
+            </w:r>
+          </w:p>
+        </w:tc>
+        <w:tc>
+          <w:tcPr>
+            <w:tcW w:type="dxa" w:w="2400"/>
             <w:tcBorders>
               <w:top w:val="single" w:color="D9DEE8" w:sz="4"/>
               <w:left w:val="single" w:color="D9DEE8" w:sz="4"/>
@@ -1167,7 +1040,7 @@
       <w:tr>
         <w:tc>
           <w:tcPr>
-            <w:tcW w:type="dxa" w:w="1550"/>
+            <w:tcW w:type="dxa" w:w="1300"/>
             <w:tcBorders>
               <w:top w:val="single" w:color="D9DEE8" w:sz="4"/>
               <w:left w:val="single" w:color="D9DEE8" w:sz="4"/>
@@ -1201,7 +1074,7 @@
         </w:tc>
         <w:tc>
           <w:tcPr>
-            <w:tcW w:type="dxa" w:w="1750"/>
+            <w:tcW w:type="dxa" w:w="1450"/>
             <w:tcBorders>
               <w:top w:val="single" w:color="D9DEE8" w:sz="4"/>
               <w:left w:val="single" w:color="D9DEE8" w:sz="4"/>
@@ -1235,7 +1108,7 @@
         </w:tc>
         <w:tc>
           <w:tcPr>
-            <w:tcW w:type="dxa" w:w="1600"/>
+            <w:tcW w:type="dxa" w:w="1450"/>
             <w:tcBorders>
               <w:top w:val="single" w:color="D9DEE8" w:sz="4"/>
               <w:left w:val="single" w:color="D9DEE8" w:sz="4"/>
@@ -1269,69 +1142,69 @@
         </w:tc>
         <w:tc>
           <w:tcPr>
-            <w:tcW w:type="dxa" w:w="1500"/>
-            <w:tcBorders>
-              <w:top w:val="single" w:color="D9DEE8" w:sz="4"/>
-              <w:left w:val="single" w:color="D9DEE8" w:sz="4"/>
-              <w:bottom w:val="single" w:color="D9DEE8" w:sz="4"/>
-              <w:right w:val="single" w:color="D9DEE8" w:sz="4"/>
-            </w:tcBorders>
-            <w:shd w:fill="FFFFFF" w:color="auto" w:val="clear"/>
-            <w:tcMar>
-              <w:top w:type="dxa" w:w="58"/>
-              <w:left w:type="dxa" w:w="90"/>
-              <w:bottom w:type="dxa" w:w="58"/>
-              <w:right w:type="dxa" w:w="90"/>
-            </w:tcMar>
-          </w:tcPr>
-          <w:p>
-            <w:pPr>
-              <w:spacing w:after="0" w:line="246"/>
-            </w:pPr>
-            <w:r>
-              <w:rPr>
-                <w:rFonts w:ascii="Calibri" w:cs="Calibri" w:eastAsia="Calibri" w:hAnsi="Calibri"/>
-                <w:b w:val="false"/>
-                <w:bCs w:val="false"/>
-                <w:color w:val="24303F"/>
-                <w:sz w:val="13"/>
-                <w:szCs w:val="13"/>
-              </w:rPr>
-              <w:t xml:space="preserve">Verify</w:t>
-            </w:r>
-          </w:p>
-        </w:tc>
-        <w:tc>
-          <w:tcPr>
-            <w:tcW w:type="dxa" w:w="2960"/>
-            <w:tcBorders>
-              <w:top w:val="single" w:color="D9DEE8" w:sz="4"/>
-              <w:left w:val="single" w:color="D9DEE8" w:sz="4"/>
-              <w:bottom w:val="single" w:color="D9DEE8" w:sz="4"/>
-              <w:right w:val="single" w:color="D9DEE8" w:sz="4"/>
-            </w:tcBorders>
-            <w:shd w:fill="FFFFFF" w:color="auto" w:val="clear"/>
-            <w:tcMar>
-              <w:top w:type="dxa" w:w="58"/>
-              <w:left w:type="dxa" w:w="90"/>
-              <w:bottom w:type="dxa" w:w="58"/>
-              <w:right w:type="dxa" w:w="90"/>
-            </w:tcMar>
-          </w:tcPr>
-          <w:p>
-            <w:pPr>
-              <w:spacing w:after="0" w:line="246"/>
-            </w:pPr>
-            <w:r>
-              <w:rPr>
-                <w:rFonts w:ascii="Calibri" w:cs="Calibri" w:eastAsia="Calibri" w:hAnsi="Calibri"/>
-                <w:b w:val="false"/>
-                <w:bCs w:val="false"/>
-                <w:color w:val="24303F"/>
-                <w:sz w:val="13"/>
-                <w:szCs w:val="13"/>
-              </w:rPr>
-              <w:t xml:space="preserve">Reselling a broad catalogue of digital services</w:t>
+            <w:tcW w:type="dxa" w:w="2760"/>
+            <w:tcBorders>
+              <w:top w:val="single" w:color="D9DEE8" w:sz="4"/>
+              <w:left w:val="single" w:color="D9DEE8" w:sz="4"/>
+              <w:bottom w:val="single" w:color="D9DEE8" w:sz="4"/>
+              <w:right w:val="single" w:color="D9DEE8" w:sz="4"/>
+            </w:tcBorders>
+            <w:shd w:fill="FFFFFF" w:color="auto" w:val="clear"/>
+            <w:tcMar>
+              <w:top w:type="dxa" w:w="58"/>
+              <w:left w:type="dxa" w:w="90"/>
+              <w:bottom w:type="dxa" w:w="58"/>
+              <w:right w:type="dxa" w:w="90"/>
+            </w:tcMar>
+          </w:tcPr>
+          <w:p>
+            <w:pPr>
+              <w:spacing w:after="0" w:line="246"/>
+            </w:pPr>
+            <w:r>
+              <w:rPr>
+                <w:rFonts w:ascii="Calibri" w:cs="Calibri" w:eastAsia="Calibri" w:hAnsi="Calibri"/>
+                <w:b w:val="false"/>
+                <w:bCs w:val="false"/>
+                <w:color w:val="24303F"/>
+                <w:sz w:val="13"/>
+                <w:szCs w:val="13"/>
+              </w:rPr>
+              <w:t xml:space="preserve">SOC 2 Type II. Broad catalogue, not voice-specific</w:t>
+            </w:r>
+          </w:p>
+        </w:tc>
+        <w:tc>
+          <w:tcPr>
+            <w:tcW w:type="dxa" w:w="2400"/>
+            <w:tcBorders>
+              <w:top w:val="single" w:color="D9DEE8" w:sz="4"/>
+              <w:left w:val="single" w:color="D9DEE8" w:sz="4"/>
+              <w:bottom w:val="single" w:color="D9DEE8" w:sz="4"/>
+              <w:right w:val="single" w:color="D9DEE8" w:sz="4"/>
+            </w:tcBorders>
+            <w:shd w:fill="FFFFFF" w:color="auto" w:val="clear"/>
+            <w:tcMar>
+              <w:top w:type="dxa" w:w="58"/>
+              <w:left w:type="dxa" w:w="90"/>
+              <w:bottom w:type="dxa" w:w="58"/>
+              <w:right w:type="dxa" w:w="90"/>
+            </w:tcMar>
+          </w:tcPr>
+          <w:p>
+            <w:pPr>
+              <w:spacing w:after="0" w:line="246"/>
+            </w:pPr>
+            <w:r>
+              <w:rPr>
+                <w:rFonts w:ascii="Calibri" w:cs="Calibri" w:eastAsia="Calibri" w:hAnsi="Calibri"/>
+                <w:b w:val="false"/>
+                <w:bCs w:val="false"/>
+                <w:color w:val="24303F"/>
+                <w:sz w:val="13"/>
+                <w:szCs w:val="13"/>
+              </w:rPr>
+              <w:t xml:space="preserve">Reselling a wide range of digital services</w:t>
             </w:r>
           </w:p>
         </w:tc>
@@ -1339,7 +1212,7 @@
       <w:tr>
         <w:tc>
           <w:tcPr>
-            <w:tcW w:type="dxa" w:w="1550"/>
+            <w:tcW w:type="dxa" w:w="1300"/>
             <w:tcBorders>
               <w:top w:val="single" w:color="D9DEE8" w:sz="4"/>
               <w:left w:val="single" w:color="D9DEE8" w:sz="4"/>
@@ -1373,7 +1246,7 @@
         </w:tc>
         <w:tc>
           <w:tcPr>
-            <w:tcW w:type="dxa" w:w="1750"/>
+            <w:tcW w:type="dxa" w:w="1450"/>
             <w:tcBorders>
               <w:top w:val="single" w:color="D9DEE8" w:sz="4"/>
               <w:left w:val="single" w:color="D9DEE8" w:sz="4"/>
@@ -1407,75 +1280,75 @@
         </w:tc>
         <w:tc>
           <w:tcPr>
-            <w:tcW w:type="dxa" w:w="1600"/>
-            <w:tcBorders>
-              <w:top w:val="single" w:color="D9DEE8" w:sz="4"/>
-              <w:left w:val="single" w:color="D9DEE8" w:sz="4"/>
-              <w:bottom w:val="single" w:color="D9DEE8" w:sz="4"/>
-              <w:right w:val="single" w:color="D9DEE8" w:sz="4"/>
-            </w:tcBorders>
-            <w:shd w:fill="FFFFFF" w:color="auto" w:val="clear"/>
-            <w:tcMar>
-              <w:top w:type="dxa" w:w="58"/>
-              <w:left w:type="dxa" w:w="90"/>
-              <w:bottom w:type="dxa" w:w="58"/>
-              <w:right w:type="dxa" w:w="90"/>
-            </w:tcMar>
-          </w:tcPr>
-          <w:p>
-            <w:pPr>
-              <w:spacing w:after="0" w:line="246"/>
-            </w:pPr>
-            <w:r>
-              <w:rPr>
-                <w:rFonts w:ascii="Calibri" w:cs="Calibri" w:eastAsia="Calibri" w:hAnsi="Calibri"/>
-                <w:b w:val="false"/>
-                <w:bCs w:val="false"/>
-                <w:color w:val="24303F"/>
-                <w:sz w:val="13"/>
-                <w:szCs w:val="13"/>
-              </w:rPr>
-              <w:t xml:space="preserve">White-label tier</w:t>
-            </w:r>
-          </w:p>
-        </w:tc>
-        <w:tc>
-          <w:tcPr>
-            <w:tcW w:type="dxa" w:w="1500"/>
-            <w:tcBorders>
-              <w:top w:val="single" w:color="D9DEE8" w:sz="4"/>
-              <w:left w:val="single" w:color="D9DEE8" w:sz="4"/>
-              <w:bottom w:val="single" w:color="D9DEE8" w:sz="4"/>
-              <w:right w:val="single" w:color="D9DEE8" w:sz="4"/>
-            </w:tcBorders>
-            <w:shd w:fill="FFFFFF" w:color="auto" w:val="clear"/>
-            <w:tcMar>
-              <w:top w:type="dxa" w:w="58"/>
-              <w:left w:type="dxa" w:w="90"/>
-              <w:bottom w:type="dxa" w:w="58"/>
-              <w:right w:type="dxa" w:w="90"/>
-            </w:tcMar>
-          </w:tcPr>
-          <w:p>
-            <w:pPr>
-              <w:spacing w:after="0" w:line="246"/>
-            </w:pPr>
-            <w:r>
-              <w:rPr>
-                <w:rFonts w:ascii="Calibri" w:cs="Calibri" w:eastAsia="Calibri" w:hAnsi="Calibri"/>
-                <w:b w:val="false"/>
-                <w:bCs w:val="false"/>
-                <w:color w:val="24303F"/>
-                <w:sz w:val="13"/>
-                <w:szCs w:val="13"/>
-              </w:rPr>
-              <w:t xml:space="preserve">Verify</w:t>
-            </w:r>
-          </w:p>
-        </w:tc>
-        <w:tc>
-          <w:tcPr>
-            <w:tcW w:type="dxa" w:w="2960"/>
+            <w:tcW w:type="dxa" w:w="1450"/>
+            <w:tcBorders>
+              <w:top w:val="single" w:color="D9DEE8" w:sz="4"/>
+              <w:left w:val="single" w:color="D9DEE8" w:sz="4"/>
+              <w:bottom w:val="single" w:color="D9DEE8" w:sz="4"/>
+              <w:right w:val="single" w:color="D9DEE8" w:sz="4"/>
+            </w:tcBorders>
+            <w:shd w:fill="FFFFFF" w:color="auto" w:val="clear"/>
+            <w:tcMar>
+              <w:top w:type="dxa" w:w="58"/>
+              <w:left w:type="dxa" w:w="90"/>
+              <w:bottom w:type="dxa" w:w="58"/>
+              <w:right w:type="dxa" w:w="90"/>
+            </w:tcMar>
+          </w:tcPr>
+          <w:p>
+            <w:pPr>
+              <w:spacing w:after="0" w:line="246"/>
+            </w:pPr>
+            <w:r>
+              <w:rPr>
+                <w:rFonts w:ascii="Calibri" w:cs="Calibri" w:eastAsia="Calibri" w:hAnsi="Calibri"/>
+                <w:b w:val="false"/>
+                <w:bCs w:val="false"/>
+                <w:color w:val="24303F"/>
+                <w:sz w:val="13"/>
+                <w:szCs w:val="13"/>
+              </w:rPr>
+              <w:t xml:space="preserve">White-label add-on</w:t>
+            </w:r>
+          </w:p>
+        </w:tc>
+        <w:tc>
+          <w:tcPr>
+            <w:tcW w:type="dxa" w:w="2760"/>
+            <w:tcBorders>
+              <w:top w:val="single" w:color="D9DEE8" w:sz="4"/>
+              <w:left w:val="single" w:color="D9DEE8" w:sz="4"/>
+              <w:bottom w:val="single" w:color="D9DEE8" w:sz="4"/>
+              <w:right w:val="single" w:color="D9DEE8" w:sz="4"/>
+            </w:tcBorders>
+            <w:shd w:fill="FFFFFF" w:color="auto" w:val="clear"/>
+            <w:tcMar>
+              <w:top w:type="dxa" w:w="58"/>
+              <w:left w:type="dxa" w:w="90"/>
+              <w:bottom w:type="dxa" w:w="58"/>
+              <w:right w:type="dxa" w:w="90"/>
+            </w:tcMar>
+          </w:tcPr>
+          <w:p>
+            <w:pPr>
+              <w:spacing w:after="0" w:line="246"/>
+            </w:pPr>
+            <w:r>
+              <w:rPr>
+                <w:rFonts w:ascii="Calibri" w:cs="Calibri" w:eastAsia="Calibri" w:hAnsi="Calibri"/>
+                <w:b w:val="false"/>
+                <w:bCs w:val="false"/>
+                <w:color w:val="24303F"/>
+                <w:sz w:val="13"/>
+                <w:szCs w:val="13"/>
+              </w:rPr>
+              <w:t xml:space="preserve">SOC 2, HIPAA, GDPR, ISO 27001. White-label is an add-on layer</w:t>
+            </w:r>
+          </w:p>
+        </w:tc>
+        <w:tc>
+          <w:tcPr>
+            <w:tcW w:type="dxa" w:w="2400"/>
             <w:tcBorders>
               <w:top w:val="single" w:color="D9DEE8" w:sz="4"/>
               <w:left w:val="single" w:color="D9DEE8" w:sz="4"/>
@@ -1511,7 +1384,7 @@
       <w:tr>
         <w:tc>
           <w:tcPr>
-            <w:tcW w:type="dxa" w:w="1550"/>
+            <w:tcW w:type="dxa" w:w="1300"/>
             <w:tcBorders>
               <w:top w:val="single" w:color="D9DEE8" w:sz="4"/>
               <w:left w:val="single" w:color="D9DEE8" w:sz="4"/>
@@ -1545,7 +1418,7 @@
         </w:tc>
         <w:tc>
           <w:tcPr>
-            <w:tcW w:type="dxa" w:w="1750"/>
+            <w:tcW w:type="dxa" w:w="1450"/>
             <w:tcBorders>
               <w:top w:val="single" w:color="D9DEE8" w:sz="4"/>
               <w:left w:val="single" w:color="D9DEE8" w:sz="4"/>
@@ -1579,7 +1452,7 @@
         </w:tc>
         <w:tc>
           <w:tcPr>
-            <w:tcW w:type="dxa" w:w="1600"/>
+            <w:tcW w:type="dxa" w:w="1450"/>
             <w:tcBorders>
               <w:top w:val="single" w:color="D9DEE8" w:sz="4"/>
               <w:left w:val="single" w:color="D9DEE8" w:sz="4"/>
@@ -1613,41 +1486,41 @@
         </w:tc>
         <w:tc>
           <w:tcPr>
-            <w:tcW w:type="dxa" w:w="1500"/>
-            <w:tcBorders>
-              <w:top w:val="single" w:color="D9DEE8" w:sz="4"/>
-              <w:left w:val="single" w:color="D9DEE8" w:sz="4"/>
-              <w:bottom w:val="single" w:color="D9DEE8" w:sz="4"/>
-              <w:right w:val="single" w:color="D9DEE8" w:sz="4"/>
-            </w:tcBorders>
-            <w:shd w:fill="FFFFFF" w:color="auto" w:val="clear"/>
-            <w:tcMar>
-              <w:top w:type="dxa" w:w="58"/>
-              <w:left w:type="dxa" w:w="90"/>
-              <w:bottom w:type="dxa" w:w="58"/>
-              <w:right w:type="dxa" w:w="90"/>
-            </w:tcMar>
-          </w:tcPr>
-          <w:p>
-            <w:pPr>
-              <w:spacing w:after="0" w:line="246"/>
-            </w:pPr>
-            <w:r>
-              <w:rPr>
-                <w:rFonts w:ascii="Calibri" w:cs="Calibri" w:eastAsia="Calibri" w:hAnsi="Calibri"/>
-                <w:b w:val="false"/>
-                <w:bCs w:val="false"/>
-                <w:color w:val="24303F"/>
-                <w:sz w:val="13"/>
-                <w:szCs w:val="13"/>
-              </w:rPr>
-              <w:t xml:space="preserve">Verify</w:t>
-            </w:r>
-          </w:p>
-        </w:tc>
-        <w:tc>
-          <w:tcPr>
-            <w:tcW w:type="dxa" w:w="2960"/>
+            <w:tcW w:type="dxa" w:w="2760"/>
+            <w:tcBorders>
+              <w:top w:val="single" w:color="D9DEE8" w:sz="4"/>
+              <w:left w:val="single" w:color="D9DEE8" w:sz="4"/>
+              <w:bottom w:val="single" w:color="D9DEE8" w:sz="4"/>
+              <w:right w:val="single" w:color="D9DEE8" w:sz="4"/>
+            </w:tcBorders>
+            <w:shd w:fill="FFFFFF" w:color="auto" w:val="clear"/>
+            <w:tcMar>
+              <w:top w:type="dxa" w:w="58"/>
+              <w:left w:type="dxa" w:w="90"/>
+              <w:bottom w:type="dxa" w:w="58"/>
+              <w:right w:type="dxa" w:w="90"/>
+            </w:tcMar>
+          </w:tcPr>
+          <w:p>
+            <w:pPr>
+              <w:spacing w:after="0" w:line="246"/>
+            </w:pPr>
+            <w:r>
+              <w:rPr>
+                <w:rFonts w:ascii="Calibri" w:cs="Calibri" w:eastAsia="Calibri" w:hAnsi="Calibri"/>
+                <w:b w:val="false"/>
+                <w:bCs w:val="false"/>
+                <w:color w:val="24303F"/>
+                <w:sz w:val="13"/>
+                <w:szCs w:val="13"/>
+              </w:rPr>
+              <w:t xml:space="preserve">SOC 2 Type II, GDPR, HIPAA (BAA on the Pro tier). Compliance obligations sit with you</w:t>
+            </w:r>
+          </w:p>
+        </w:tc>
+        <w:tc>
+          <w:tcPr>
+            <w:tcW w:type="dxa" w:w="2400"/>
             <w:tcBorders>
               <w:top w:val="single" w:color="D9DEE8" w:sz="4"/>
               <w:left w:val="single" w:color="D9DEE8" w:sz="4"/>
@@ -1683,7 +1556,7 @@
       <w:tr>
         <w:tc>
           <w:tcPr>
-            <w:tcW w:type="dxa" w:w="1550"/>
+            <w:tcW w:type="dxa" w:w="1300"/>
             <w:tcBorders>
               <w:top w:val="single" w:color="D9DEE8" w:sz="4"/>
               <w:left w:val="single" w:color="D9DEE8" w:sz="4"/>
@@ -1717,7 +1590,7 @@
         </w:tc>
         <w:tc>
           <w:tcPr>
-            <w:tcW w:type="dxa" w:w="1750"/>
+            <w:tcW w:type="dxa" w:w="1450"/>
             <w:tcBorders>
               <w:top w:val="single" w:color="D9DEE8" w:sz="4"/>
               <w:left w:val="single" w:color="D9DEE8" w:sz="4"/>
@@ -1751,7 +1624,7 @@
         </w:tc>
         <w:tc>
           <w:tcPr>
-            <w:tcW w:type="dxa" w:w="1600"/>
+            <w:tcW w:type="dxa" w:w="1450"/>
             <w:tcBorders>
               <w:top w:val="single" w:color="D9DEE8" w:sz="4"/>
               <w:left w:val="single" w:color="D9DEE8" w:sz="4"/>
@@ -1785,41 +1658,41 @@
         </w:tc>
         <w:tc>
           <w:tcPr>
-            <w:tcW w:type="dxa" w:w="1500"/>
-            <w:tcBorders>
-              <w:top w:val="single" w:color="D9DEE8" w:sz="4"/>
-              <w:left w:val="single" w:color="D9DEE8" w:sz="4"/>
-              <w:bottom w:val="single" w:color="D9DEE8" w:sz="4"/>
-              <w:right w:val="single" w:color="D9DEE8" w:sz="4"/>
-            </w:tcBorders>
-            <w:shd w:fill="FFFFFF" w:color="auto" w:val="clear"/>
-            <w:tcMar>
-              <w:top w:type="dxa" w:w="58"/>
-              <w:left w:type="dxa" w:w="90"/>
-              <w:bottom w:type="dxa" w:w="58"/>
-              <w:right w:type="dxa" w:w="90"/>
-            </w:tcMar>
-          </w:tcPr>
-          <w:p>
-            <w:pPr>
-              <w:spacing w:after="0" w:line="246"/>
-            </w:pPr>
-            <w:r>
-              <w:rPr>
-                <w:rFonts w:ascii="Calibri" w:cs="Calibri" w:eastAsia="Calibri" w:hAnsi="Calibri"/>
-                <w:b w:val="false"/>
-                <w:bCs w:val="false"/>
-                <w:color w:val="24303F"/>
-                <w:sz w:val="13"/>
-                <w:szCs w:val="13"/>
-              </w:rPr>
-              <w:t xml:space="preserve">Verify</w:t>
-            </w:r>
-          </w:p>
-        </w:tc>
-        <w:tc>
-          <w:tcPr>
-            <w:tcW w:type="dxa" w:w="2960"/>
+            <w:tcW w:type="dxa" w:w="2760"/>
+            <w:tcBorders>
+              <w:top w:val="single" w:color="D9DEE8" w:sz="4"/>
+              <w:left w:val="single" w:color="D9DEE8" w:sz="4"/>
+              <w:bottom w:val="single" w:color="D9DEE8" w:sz="4"/>
+              <w:right w:val="single" w:color="D9DEE8" w:sz="4"/>
+            </w:tcBorders>
+            <w:shd w:fill="FFFFFF" w:color="auto" w:val="clear"/>
+            <w:tcMar>
+              <w:top w:type="dxa" w:w="58"/>
+              <w:left w:type="dxa" w:w="90"/>
+              <w:bottom w:type="dxa" w:w="58"/>
+              <w:right w:type="dxa" w:w="90"/>
+            </w:tcMar>
+          </w:tcPr>
+          <w:p>
+            <w:pPr>
+              <w:spacing w:after="0" w:line="246"/>
+            </w:pPr>
+            <w:r>
+              <w:rPr>
+                <w:rFonts w:ascii="Calibri" w:cs="Calibri" w:eastAsia="Calibri" w:hAnsi="Calibri"/>
+                <w:b w:val="false"/>
+                <w:bCs w:val="false"/>
+                <w:color w:val="24303F"/>
+                <w:sz w:val="13"/>
+                <w:szCs w:val="13"/>
+              </w:rPr>
+              <w:t xml:space="preserve">GDPR only. No HIPAA, which rules out healthcare</w:t>
+            </w:r>
+          </w:p>
+        </w:tc>
+        <w:tc>
+          <w:tcPr>
+            <w:tcW w:type="dxa" w:w="2400"/>
             <w:tcBorders>
               <w:top w:val="single" w:color="D9DEE8" w:sz="4"/>
               <w:left w:val="single" w:color="D9DEE8" w:sz="4"/>
@@ -1855,7 +1728,7 @@
       <w:tr>
         <w:tc>
           <w:tcPr>
-            <w:tcW w:type="dxa" w:w="1550"/>
+            <w:tcW w:type="dxa" w:w="1300"/>
             <w:tcBorders>
               <w:top w:val="single" w:color="D9DEE8" w:sz="4"/>
               <w:left w:val="single" w:color="D9DEE8" w:sz="4"/>
@@ -1889,7 +1762,7 @@
         </w:tc>
         <w:tc>
           <w:tcPr>
-            <w:tcW w:type="dxa" w:w="1750"/>
+            <w:tcW w:type="dxa" w:w="1450"/>
             <w:tcBorders>
               <w:top w:val="single" w:color="D9DEE8" w:sz="4"/>
               <w:left w:val="single" w:color="D9DEE8" w:sz="4"/>
@@ -1923,7 +1796,7 @@
         </w:tc>
         <w:tc>
           <w:tcPr>
-            <w:tcW w:type="dxa" w:w="1600"/>
+            <w:tcW w:type="dxa" w:w="1450"/>
             <w:tcBorders>
               <w:top w:val="single" w:color="D9DEE8" w:sz="4"/>
               <w:left w:val="single" w:color="D9DEE8" w:sz="4"/>
@@ -1957,41 +1830,41 @@
         </w:tc>
         <w:tc>
           <w:tcPr>
-            <w:tcW w:type="dxa" w:w="1500"/>
-            <w:tcBorders>
-              <w:top w:val="single" w:color="D9DEE8" w:sz="4"/>
-              <w:left w:val="single" w:color="D9DEE8" w:sz="4"/>
-              <w:bottom w:val="single" w:color="D9DEE8" w:sz="4"/>
-              <w:right w:val="single" w:color="D9DEE8" w:sz="4"/>
-            </w:tcBorders>
-            <w:shd w:fill="FFFFFF" w:color="auto" w:val="clear"/>
-            <w:tcMar>
-              <w:top w:type="dxa" w:w="58"/>
-              <w:left w:type="dxa" w:w="90"/>
-              <w:bottom w:type="dxa" w:w="58"/>
-              <w:right w:type="dxa" w:w="90"/>
-            </w:tcMar>
-          </w:tcPr>
-          <w:p>
-            <w:pPr>
-              <w:spacing w:after="0" w:line="246"/>
-            </w:pPr>
-            <w:r>
-              <w:rPr>
-                <w:rFonts w:ascii="Calibri" w:cs="Calibri" w:eastAsia="Calibri" w:hAnsi="Calibri"/>
-                <w:b w:val="false"/>
-                <w:bCs w:val="false"/>
-                <w:color w:val="24303F"/>
-                <w:sz w:val="13"/>
-                <w:szCs w:val="13"/>
-              </w:rPr>
-              <w:t xml:space="preserve">Verify</w:t>
-            </w:r>
-          </w:p>
-        </w:tc>
-        <w:tc>
-          <w:tcPr>
-            <w:tcW w:type="dxa" w:w="2960"/>
+            <w:tcW w:type="dxa" w:w="2760"/>
+            <w:tcBorders>
+              <w:top w:val="single" w:color="D9DEE8" w:sz="4"/>
+              <w:left w:val="single" w:color="D9DEE8" w:sz="4"/>
+              <w:bottom w:val="single" w:color="D9DEE8" w:sz="4"/>
+              <w:right w:val="single" w:color="D9DEE8" w:sz="4"/>
+            </w:tcBorders>
+            <w:shd w:fill="FFFFFF" w:color="auto" w:val="clear"/>
+            <w:tcMar>
+              <w:top w:type="dxa" w:w="58"/>
+              <w:left w:type="dxa" w:w="90"/>
+              <w:bottom w:type="dxa" w:w="58"/>
+              <w:right w:type="dxa" w:w="90"/>
+            </w:tcMar>
+          </w:tcPr>
+          <w:p>
+            <w:pPr>
+              <w:spacing w:after="0" w:line="246"/>
+            </w:pPr>
+            <w:r>
+              <w:rPr>
+                <w:rFonts w:ascii="Calibri" w:cs="Calibri" w:eastAsia="Calibri" w:hAnsi="Calibri"/>
+                <w:b w:val="false"/>
+                <w:bCs w:val="false"/>
+                <w:color w:val="24303F"/>
+                <w:sz w:val="13"/>
+                <w:szCs w:val="13"/>
+              </w:rPr>
+              <w:t xml:space="preserve">GDPR. SOC 2 and HIPAA not publicly published</w:t>
+            </w:r>
+          </w:p>
+        </w:tc>
+        <w:tc>
+          <w:tcPr>
+            <w:tcW w:type="dxa" w:w="2400"/>
             <w:tcBorders>
               <w:top w:val="single" w:color="D9DEE8" w:sz="4"/>
               <w:left w:val="single" w:color="D9DEE8" w:sz="4"/>
@@ -2027,7 +1900,7 @@
       <w:tr>
         <w:tc>
           <w:tcPr>
-            <w:tcW w:type="dxa" w:w="1550"/>
+            <w:tcW w:type="dxa" w:w="1300"/>
             <w:tcBorders>
               <w:top w:val="single" w:color="D9DEE8" w:sz="4"/>
               <w:left w:val="single" w:color="D9DEE8" w:sz="4"/>
@@ -2061,7 +1934,7 @@
         </w:tc>
         <w:tc>
           <w:tcPr>
-            <w:tcW w:type="dxa" w:w="1750"/>
+            <w:tcW w:type="dxa" w:w="1450"/>
             <w:tcBorders>
               <w:top w:val="single" w:color="D9DEE8" w:sz="4"/>
               <w:left w:val="single" w:color="D9DEE8" w:sz="4"/>
@@ -2095,7 +1968,7 @@
         </w:tc>
         <w:tc>
           <w:tcPr>
-            <w:tcW w:type="dxa" w:w="1600"/>
+            <w:tcW w:type="dxa" w:w="1450"/>
             <w:tcBorders>
               <w:top w:val="single" w:color="D9DEE8" w:sz="4"/>
               <w:left w:val="single" w:color="D9DEE8" w:sz="4"/>
@@ -2129,41 +2002,41 @@
         </w:tc>
         <w:tc>
           <w:tcPr>
-            <w:tcW w:type="dxa" w:w="1500"/>
-            <w:tcBorders>
-              <w:top w:val="single" w:color="D9DEE8" w:sz="4"/>
-              <w:left w:val="single" w:color="D9DEE8" w:sz="4"/>
-              <w:bottom w:val="single" w:color="D9DEE8" w:sz="4"/>
-              <w:right w:val="single" w:color="D9DEE8" w:sz="4"/>
-            </w:tcBorders>
-            <w:shd w:fill="FFFFFF" w:color="auto" w:val="clear"/>
-            <w:tcMar>
-              <w:top w:type="dxa" w:w="58"/>
-              <w:left w:type="dxa" w:w="90"/>
-              <w:bottom w:type="dxa" w:w="58"/>
-              <w:right w:type="dxa" w:w="90"/>
-            </w:tcMar>
-          </w:tcPr>
-          <w:p>
-            <w:pPr>
-              <w:spacing w:after="0" w:line="246"/>
-            </w:pPr>
-            <w:r>
-              <w:rPr>
-                <w:rFonts w:ascii="Calibri" w:cs="Calibri" w:eastAsia="Calibri" w:hAnsi="Calibri"/>
-                <w:b w:val="false"/>
-                <w:bCs w:val="false"/>
-                <w:color w:val="24303F"/>
-                <w:sz w:val="13"/>
-                <w:szCs w:val="13"/>
-              </w:rPr>
-              <w:t xml:space="preserve">Included: SOC 2 II, ISO 27001, HIPAA, GDPR, ACMA, TCPA</w:t>
-            </w:r>
-          </w:p>
-        </w:tc>
-        <w:tc>
-          <w:tcPr>
-            <w:tcW w:type="dxa" w:w="2960"/>
+            <w:tcW w:type="dxa" w:w="2760"/>
+            <w:tcBorders>
+              <w:top w:val="single" w:color="D9DEE8" w:sz="4"/>
+              <w:left w:val="single" w:color="D9DEE8" w:sz="4"/>
+              <w:bottom w:val="single" w:color="D9DEE8" w:sz="4"/>
+              <w:right w:val="single" w:color="D9DEE8" w:sz="4"/>
+            </w:tcBorders>
+            <w:shd w:fill="FFFFFF" w:color="auto" w:val="clear"/>
+            <w:tcMar>
+              <w:top w:type="dxa" w:w="58"/>
+              <w:left w:type="dxa" w:w="90"/>
+              <w:bottom w:type="dxa" w:w="58"/>
+              <w:right w:type="dxa" w:w="90"/>
+            </w:tcMar>
+          </w:tcPr>
+          <w:p>
+            <w:pPr>
+              <w:spacing w:after="0" w:line="246"/>
+            </w:pPr>
+            <w:r>
+              <w:rPr>
+                <w:rFonts w:ascii="Calibri" w:cs="Calibri" w:eastAsia="Calibri" w:hAnsi="Calibri"/>
+                <w:b w:val="false"/>
+                <w:bCs w:val="false"/>
+                <w:color w:val="24303F"/>
+                <w:sz w:val="13"/>
+                <w:szCs w:val="13"/>
+              </w:rPr>
+              <w:t xml:space="preserve">SOC 2 Type II, ISO 27001, HIPAA, GDPR, ACMA, TCPA. Built in, with audit trails on every workspace</w:t>
+            </w:r>
+          </w:p>
+        </w:tc>
+        <w:tc>
+          <w:tcPr>
+            <w:tcW w:type="dxa" w:w="2400"/>
             <w:tcBorders>
               <w:top w:val="single" w:color="D9DEE8" w:sz="4"/>
               <w:left w:val="single" w:color="D9DEE8" w:sz="4"/>
@@ -2212,7 +2085,7 @@
           <w:sz w:val="20"/>
           <w:szCs w:val="20"/>
         </w:rPr>
-        <w:t xml:space="preserve">What to watch for by group: the all-in-one suites give breadth but shallow voice depth, so you resell a whole platform rather than a focused phone product. The voice specialists differ most on pricing model and compliance, which is where margin and liability actually live. The chatbot-first tools handle text well but were not built phone-first, so check call quality and compliance if your clients live on the phone. Competitor pricing and terms move often; confirm current numbers before you commit.</w:t>
+        <w:t xml:space="preserve">What to watch for by group: the all-in-one suites give breadth but shallow voice depth, so you resell a whole platform rather than a focused phone product, and their strongest compliance often sits behind a paid add-on. The voice specialists differ most on pricing model and on where compliance responsibility lands, which is where margin and liability actually live. The chatbot-first tools handle text well but were not built phone-first, so check call quality if your clients live on the phone, and check for HIPAA if any of them are in healthcare. Terms do move, so treat this as the shape of the market rather than a contract.</w:t>
       </w:r>
     </w:p>
     <w:p>
@@ -2560,7 +2433,7 @@
           <w:sz w:val="20"/>
           <w:szCs w:val="20"/>
         </w:rPr>
-        <w:t xml:space="preserve">You keep the gap between the wholesale rate and your retail price, every month a client stays. Agencies commonly mark up two to four times cost; on Trillet, sensible pricing holds 50 to 75 per cent margins. Usage-based costs can erode that, so price with a band.</w:t>
+        <w:t xml:space="preserve">You keep the gap between the wholesale rate you pay and the retail price you charge, every month a client stays. On Trillet, usage is a flat $0.12 a minute and agencies who price sensibly hold 50 to 75 per cent margins. Usage-based costs can erode that, so price with a band rather than a flat rate.</w:t>
       </w:r>
     </w:p>
     <w:p>

</xml_diff>